<commit_message>
docs(legal): align chapter headings across the paired templates
Co-Authored-By: Claude Fable 5.1 <noreply@anthropic.com>
Claude-Session: https://claude.ai/code/session_01AVM926ubKsaqkthGFjJRy4
</commit_message>
<xml_diff>
--- a/docs/legal/dist/02-founding-decision.docx
+++ b/docs/legal/dist/02-founding-decision.docx
@@ -87,8 +87,88 @@
       <w:tr>
         <w:tc>
           <w:tcPr>
-            <w:tcW w:type="dxa" w:w="9906"/>
-            <w:gridSpan w:val="2"/>
+            <w:tcW w:type="dxa" w:w="4953"/>
+            <w:tcMar>
+              <w:top w:type="dxa" w:w="80"/>
+              <w:left w:type="dxa" w:w="100"/>
+              <w:bottom w:type="dxa" w:w="80"/>
+              <w:right w:type="dxa" w:w="100"/>
+            </w:tcMar>
+          </w:tcPr>
+          <w:p>
+            <w:pPr>
+              <w:spacing w:after="100"/>
+            </w:pPr>
+            <w:r>
+              <w:rPr>
+                <w:rFonts w:ascii="Arial" w:cs="Arial" w:eastAsia="Arial" w:hAnsi="Arial"/>
+                <w:sz w:val="18"/>
+                <w:szCs w:val="18"/>
+              </w:rPr>
+              <w:t xml:space="preserve">Na osnovu člana 11 Zakona o nevladinim organizacijama (Sl. List Crne Gore br. 39/11 i 37/17), Osnivačka Skupština ____________ (naziv organizacije), donosi</w:t>
+            </w:r>
+          </w:p>
+        </w:tc>
+        <w:tc>
+          <w:tcPr>
+            <w:tcW w:type="dxa" w:w="4953"/>
+            <w:tcMar>
+              <w:top w:type="dxa" w:w="80"/>
+              <w:left w:type="dxa" w:w="100"/>
+              <w:bottom w:type="dxa" w:w="80"/>
+              <w:right w:type="dxa" w:w="100"/>
+            </w:tcMar>
+          </w:tcPr>
+          <w:p>
+            <w:pPr>
+              <w:spacing w:after="100"/>
+            </w:pPr>
+            <w:r>
+              <w:rPr>
+                <w:rFonts w:ascii="Arial" w:cs="Arial" w:eastAsia="Arial" w:hAnsi="Arial"/>
+                <w:sz w:val="18"/>
+                <w:szCs w:val="18"/>
+              </w:rPr>
+              <w:t xml:space="preserve">English translation of </w:t>
+            </w:r>
+            <w:r>
+              <w:rPr>
+                <w:rFonts w:ascii="Arial" w:cs="Arial" w:eastAsia="Arial" w:hAnsi="Arial"/>
+                <w:i/>
+                <w:iCs/>
+                <w:sz w:val="18"/>
+                <w:szCs w:val="18"/>
+              </w:rPr>
+              <w:t xml:space="preserve">Obrazac odluke o osnivanju udruženja</w:t>
+            </w:r>
+            <w:r>
+              <w:rPr>
+                <w:rFonts w:ascii="Arial" w:cs="Arial" w:eastAsia="Arial" w:hAnsi="Arial"/>
+                <w:sz w:val="18"/>
+                <w:szCs w:val="18"/>
+              </w:rPr>
+              <w:t xml:space="preserve">. Blanks are reproduced as in the original.</w:t>
+            </w:r>
+          </w:p>
+          <w:p>
+            <w:pPr>
+              <w:spacing w:after="100"/>
+            </w:pPr>
+            <w:r>
+              <w:rPr>
+                <w:rFonts w:ascii="Arial" w:cs="Arial" w:eastAsia="Arial" w:hAnsi="Arial"/>
+                <w:sz w:val="18"/>
+                <w:szCs w:val="18"/>
+              </w:rPr>
+              <w:t xml:space="preserve">Pursuant to Article 11 of the Law on Non-Governmental Organisations (Official Gazette of Montenegro nos. 39/11 and 37/17), the Founding Assembly of ____________ (name of organisation) adopts the following</w:t>
+            </w:r>
+          </w:p>
+        </w:tc>
+      </w:tr>
+      <w:tr>
+        <w:tc>
+          <w:tcPr>
+            <w:tcW w:type="dxa" w:w="4953"/>
             <w:shd w:fill="E3EBED" w:color="auto" w:val="clear"/>
             <w:tcMar>
               <w:top w:type="dxa" w:w="80"/>
@@ -107,88 +187,32 @@
                 <w:sz w:val="22"/>
                 <w:szCs w:val="22"/>
               </w:rPr>
+              <w:t xml:space="preserve">ODLUKU O OSNIVANJU</w:t>
+            </w:r>
+          </w:p>
+        </w:tc>
+        <w:tc>
+          <w:tcPr>
+            <w:tcW w:type="dxa" w:w="4953"/>
+            <w:shd w:fill="E3EBED" w:color="auto" w:val="clear"/>
+            <w:tcMar>
+              <w:top w:type="dxa" w:w="80"/>
+              <w:left w:type="dxa" w:w="100"/>
+              <w:bottom w:type="dxa" w:w="80"/>
+              <w:right w:type="dxa" w:w="100"/>
+            </w:tcMar>
+          </w:tcPr>
+          <w:p>
+            <w:r>
+              <w:rPr>
+                <w:rFonts w:ascii="Arial" w:cs="Arial" w:eastAsia="Arial" w:hAnsi="Arial"/>
+                <w:b/>
+                <w:bCs/>
+                <w:color w:val="0E3A46"/>
+                <w:sz w:val="22"/>
+                <w:szCs w:val="22"/>
+              </w:rPr>
               <w:t xml:space="preserve">DECISION ON FOUNDING</w:t>
-            </w:r>
-          </w:p>
-        </w:tc>
-      </w:tr>
-      <w:tr>
-        <w:tc>
-          <w:tcPr>
-            <w:tcW w:type="dxa" w:w="4953"/>
-            <w:tcMar>
-              <w:top w:type="dxa" w:w="80"/>
-              <w:left w:type="dxa" w:w="100"/>
-              <w:bottom w:type="dxa" w:w="80"/>
-              <w:right w:type="dxa" w:w="100"/>
-            </w:tcMar>
-          </w:tcPr>
-          <w:p>
-            <w:pPr>
-              <w:spacing w:after="100"/>
-            </w:pPr>
-            <w:r>
-              <w:rPr>
-                <w:rFonts w:ascii="Arial" w:cs="Arial" w:eastAsia="Arial" w:hAnsi="Arial"/>
-                <w:sz w:val="18"/>
-                <w:szCs w:val="18"/>
-              </w:rPr>
-              <w:t xml:space="preserve">Na osnovu člana 11 Zakona o nevladinim organizacijama (Sl. List Crne Gore br. 39/11 i 37/17), Osnivačka Skupština ____________ (naziv organizacije), donosi</w:t>
-            </w:r>
-          </w:p>
-        </w:tc>
-        <w:tc>
-          <w:tcPr>
-            <w:tcW w:type="dxa" w:w="4953"/>
-            <w:tcMar>
-              <w:top w:type="dxa" w:w="80"/>
-              <w:left w:type="dxa" w:w="100"/>
-              <w:bottom w:type="dxa" w:w="80"/>
-              <w:right w:type="dxa" w:w="100"/>
-            </w:tcMar>
-          </w:tcPr>
-          <w:p>
-            <w:pPr>
-              <w:spacing w:after="100"/>
-            </w:pPr>
-            <w:r>
-              <w:rPr>
-                <w:rFonts w:ascii="Arial" w:cs="Arial" w:eastAsia="Arial" w:hAnsi="Arial"/>
-                <w:sz w:val="18"/>
-                <w:szCs w:val="18"/>
-              </w:rPr>
-              <w:t xml:space="preserve">English translation of </w:t>
-            </w:r>
-            <w:r>
-              <w:rPr>
-                <w:rFonts w:ascii="Arial" w:cs="Arial" w:eastAsia="Arial" w:hAnsi="Arial"/>
-                <w:i/>
-                <w:iCs/>
-                <w:sz w:val="18"/>
-                <w:szCs w:val="18"/>
-              </w:rPr>
-              <w:t xml:space="preserve">Obrazac odluke o osnivanju udruženja</w:t>
-            </w:r>
-            <w:r>
-              <w:rPr>
-                <w:rFonts w:ascii="Arial" w:cs="Arial" w:eastAsia="Arial" w:hAnsi="Arial"/>
-                <w:sz w:val="18"/>
-                <w:szCs w:val="18"/>
-              </w:rPr>
-              <w:t xml:space="preserve">. Blanks are reproduced as in the original.</w:t>
-            </w:r>
-          </w:p>
-          <w:p>
-            <w:pPr>
-              <w:spacing w:after="100"/>
-            </w:pPr>
-            <w:r>
-              <w:rPr>
-                <w:rFonts w:ascii="Arial" w:cs="Arial" w:eastAsia="Arial" w:hAnsi="Arial"/>
-                <w:sz w:val="18"/>
-                <w:szCs w:val="18"/>
-              </w:rPr>
-              <w:t xml:space="preserve">Pursuant to Article 11 of the Law on Non-Governmental Organisations (Official Gazette of Montenegro nos. 39/11 and 37/17), the Founding Assembly of ____________ (name of organisation) adopts the following</w:t>
             </w:r>
           </w:p>
         </w:tc>
@@ -241,34 +265,6 @@
                 <w:szCs w:val="20"/>
               </w:rPr>
               <w:t xml:space="preserve">Article 1</w:t>
-            </w:r>
-          </w:p>
-        </w:tc>
-      </w:tr>
-      <w:tr>
-        <w:tc>
-          <w:tcPr>
-            <w:tcW w:type="dxa" w:w="9906"/>
-            <w:gridSpan w:val="2"/>
-            <w:shd w:fill="E3EBED" w:color="auto" w:val="clear"/>
-            <w:tcMar>
-              <w:top w:type="dxa" w:w="80"/>
-              <w:left w:type="dxa" w:w="100"/>
-              <w:bottom w:type="dxa" w:w="80"/>
-              <w:right w:type="dxa" w:w="100"/>
-            </w:tcMar>
-          </w:tcPr>
-          <w:p>
-            <w:r>
-              <w:rPr>
-                <w:rFonts w:ascii="Arial" w:cs="Arial" w:eastAsia="Arial" w:hAnsi="Arial"/>
-                <w:b/>
-                <w:bCs/>
-                <w:color w:val="0E3A46"/>
-                <w:sz w:val="22"/>
-                <w:szCs w:val="22"/>
-              </w:rPr>
-              <w:t xml:space="preserve">ODLUKU O OSNIVANJU</w:t>
             </w:r>
           </w:p>
         </w:tc>

</xml_diff>